<commit_message>
Update to V1.1: 正式版 V1.1, SW artwb-v2, meta 2.0, 恢复 index.html 和 README
</commit_message>
<xml_diff>
--- a/使用说明.docx
+++ b/使用说明.docx
@@ -10,7 +10,7 @@
         <w:rPr>
           <w:rFonts w:ascii="黑体" w:hAnsi="黑体" w:eastAsia="黑体"/>
         </w:rPr>
-        <w:t>综合教资备考工作台（网页端）· 使用指南 · 正式版 V1</w:t>
+        <w:t>综合教资备考工作台（网页端）· 使用指南 · 正式版 V1.1</w:t>
       </w:r>
     </w:p>
     <w:p>
@@ -74,7 +74,7 @@
           <w:rFonts w:ascii="宋体" w:hAnsi="宋体" w:eastAsia="宋体"/>
           <w:b/>
         </w:rPr>
-        <w:t>正式版 V1（网页端）对应的内部构建 = md5 `8d747c27`（完整 `8d747c2710436c415cd6b2148a4f4b50`），单文件 `综合教资备考工作台.html`（约 3.04 MB），SW 版本 `artwb-v22`，内部 `meta.version = 1.0`</w:t>
+        <w:t>正式版 V1.1（网页端）对应的内部构建 = md5 `7c10091b03f64b71083399b0a2c705cf`，单文件 `综合教资备考工作台.html`（约 3.10 MB），SW 版本 `artwb-v23`，内部 `meta.version = 1.1`</w:t>
       </w:r>
       <w:r>
         <w:rPr>
@@ -102,7 +102,7 @@
         <w:rPr>
           <w:rFonts w:ascii="宋体" w:hAnsi="宋体" w:eastAsia="宋体"/>
         </w:rPr>
-        <w:t>：网页端「正式版 V1」与安卓「V2.35.5」版本号互不对齐，仅通过 v2 同步信封实现跨端数据互通。</w:t>
+        <w:t>：网页端「正式版 V1.1」与安卓「V2.35.5」版本号互不对齐，仅通过 v2 同步信封实现跨端数据互通。</w:t>
       </w:r>
       <w:r>
         <w:br/>
@@ -1257,7 +1257,7 @@
         <w:rPr>
           <w:rFonts w:ascii="宋体" w:hAnsi="宋体" w:eastAsia="宋体"/>
         </w:rPr>
-        <w:t xml:space="preserve"> 与「正式版 V1」标识。</w:t>
+        <w:t xml:space="preserve"> 与「正式版 V1.1」标识。</w:t>
       </w:r>
     </w:p>
     <w:p>
@@ -1347,7 +1347,7 @@
         <w:rPr>
           <w:rFonts w:ascii="宋体" w:hAnsi="宋体" w:eastAsia="宋体"/>
         </w:rPr>
-        <w:t>8d747c27</w:t>
+        <w:t>7c10091b03f64b71083399b0a2c705cf</w:t>
       </w:r>
       <w:r>
         <w:rPr>

</xml_diff>